<commit_message>
docs: reposiciona cargo proposto para não colidir com gerente de infraestrutura
- Título alterado: sem "Arquitetura", foco em IA Aplicada a Áreas Corporativas
- Posicionamento deixa explícito que Arquitetura define o "como", este cargo o "onde"
- Responsabilidades ajustadas: sem sobreposição com padrões/políticas de plataforma
- Nível sugerido alinhado ao perfil de Analista Sênior, não de Arquiteto

Co-Authored-By: Claude Sonnet 4.6 <noreply@anthropic.com>
</commit_message>
<xml_diff>
--- a/data/oportunidades-fgv/aderencia_perfis_IA_DTI.docx
+++ b/data/oportunidades-fgv/aderencia_perfis_IA_DTI.docx
@@ -4855,7 +4855,7 @@
         <w:pStyle w:val="Heading3"/>
       </w:pPr>
       <w:r>
-        <w:t>ESPECIALISTA EM INTELIGÊNCIA ARTIFICIAL APLICADA &amp; ARQUITETURA DE SOLUÇÕES CORPORATIVAS</w:t>
+        <w:t>ESPECIALISTA EM IA APLICADA — SOLUÇÕES INTELIGENTES PARA ÁREAS CORPORATIVAS</w:t>
       </w:r>
     </w:p>
     <w:p>
@@ -4876,16 +4876,51 @@
         <w:spacing w:after="80"/>
       </w:pPr>
       <w:r>
-        <w:t xml:space="preserve">Este cargo não é sinônimo de Arquiteto de Sistemas — é distinto e complementar a ele. Enquanto a Arquitetura de Sistemas cuida da infraestrutura, padrões de código e integração de plataformas, este perfil cuida da </w:t>
+        <w:t xml:space="preserve">Este cargo opera exclusivamente na </w:t>
       </w:r>
       <w:r>
         <w:rPr>
           <w:b/>
         </w:rPr>
-        <w:t>camada de inteligência</w:t>
+        <w:t>camada de negócio e resultado</w:t>
       </w:r>
       <w:r>
-        <w:t>: onde e como os modelos de IA se encaixam nos processos de negócio, com que arquitetura, com que governança e com que resultado mensurável.</w:t>
+        <w:t>: identifica oportunidades de uso de IA nas áreas corporativas, especifica os requisitos funcionais das soluções e lidera sua implementação junto às áreas demandantes. A infraestrutura de plataformas, a seleção e governança de ferramentas de IA e os padrões de integração corporativa permanecem sob responsabilidade da equipe de Arquitetura de Sistemas — com quem este perfil atua em estreita colaboração, como cliente qualificado e parceiro técnico.</w:t>
+      </w:r>
+    </w:p>
+    <w:p>
+      <w:pPr>
+        <w:spacing w:after="80"/>
+      </w:pPr>
+      <w:r>
+        <w:t xml:space="preserve">Em termos práticos: a Arquitetura define </w:t>
+      </w:r>
+      <w:r>
+        <w:rPr>
+          <w:b/>
+        </w:rPr>
+        <w:t>como</w:t>
+      </w:r>
+      <w:r>
+        <w:t xml:space="preserve"> a IA pode ser usada na empresa; este cargo define </w:t>
+      </w:r>
+      <w:r>
+        <w:rPr>
+          <w:b/>
+        </w:rPr>
+        <w:t>onde</w:t>
+      </w:r>
+      <w:r>
+        <w:t xml:space="preserve"> ela deve ser usada e </w:t>
+      </w:r>
+      <w:r>
+        <w:rPr>
+          <w:b/>
+        </w:rPr>
+        <w:t>garante que gere resultado mensurável</w:t>
+      </w:r>
+      <w:r>
+        <w:t>.</w:t>
       </w:r>
     </w:p>
     <w:p>
@@ -4913,7 +4948,7 @@
         <w:t>Base estatística + IA aplicada</w:t>
       </w:r>
       <w:r>
-        <w:t xml:space="preserve"> — Não sou apenas um engenheiro que usa LLMs. Sou um estatístico que entende distribuições, erro, risco e evidência. Isso é raro em perfis de IA corporativa e produz decisões de melhor qualidade sobre quando confiar num modelo, quando não confiar e como medir.</w:t>
+        <w:t xml:space="preserve"> — Não sou apenas um engenheiro que usa LLMs. Sou um estatístico que entende distribuições, erro, risco e evidência. Isso é raro em perfis de IA corporativa e produz decisões mais sólidas sobre quando confiar num modelo, quando não confiar e como medir seu desempenho em produção.</w:t>
       </w:r>
     </w:p>
     <w:p>
@@ -4928,7 +4963,7 @@
         <w:t>Visão de processo + automação inteligente</w:t>
       </w:r>
       <w:r>
-        <w:t xml:space="preserve"> — Process2Diagram é a síntese desta competência: transformar reuniões em BPMN, atas e requisitos automaticamente não é um projeto de TI — é uma reengenharia de processo habilitada por IA. Isso exige simultaneamente domínio de BPM e de orquestração de LLMs.</w:t>
+        <w:t xml:space="preserve"> — Process2Diagram é a síntese desta competência: transformar reuniões em BPMN, atas e requisitos automaticamente não é um projeto de TI — é uma reengenharia de processo habilitada por IA. Isso exige simultaneamente domínio de BPM e de orquestração de LLMs, e não se confunde com arquitetura de infraestrutura.</w:t>
       </w:r>
     </w:p>
     <w:p>
@@ -4940,10 +4975,10 @@
         <w:rPr>
           <w:b/>
         </w:rPr>
-        <w:t>Histórico de entrega em produção</w:t>
+        <w:t>Histórico de entrega em produção, com métricas de negócio</w:t>
       </w:r>
       <w:r>
-        <w:t xml:space="preserve"> — SJUR, CIDA, NDOC e Process2Diagram são sistemas em operação real, com métricas reais (R$ 28M monitorados, &gt;96% de acurácia, 11.998 e-mails classificados). Não são POCs ou pilotos.</w:t>
+        <w:t xml:space="preserve"> — SJUR, CIDA, NDOC e Process2Diagram são sistemas em operação real, com resultados verificáveis: R$ 28M monitorados, &gt;96% de acurácia em classificação documental, 11.998 e-mails classificados com 88% de acurácia. Não são POCs ou pilotos.</w:t>
       </w:r>
     </w:p>
     <w:p>
@@ -4955,10 +4990,10 @@
         <w:rPr>
           <w:b/>
         </w:rPr>
-        <w:t>Capacidade de pontar negócio e tecnologia</w:t>
+        <w:t>Trânsito entre negócio e tecnologia</w:t>
       </w:r>
       <w:r>
-        <w:t xml:space="preserve"> — Atuo com conforto tanto na conversa com a Diretoria Jurídica quanto na depuração de um pipeline LangGraph. Esse trânsito bidirecional é a competência central do perfil proposto.</w:t>
+        <w:t xml:space="preserve"> — Atuo com igual fluência na conversa com a Diretoria Jurídica e na depuração de um pipeline LangGraph. Esse trânsito bidirecional é exatamente o que este cargo exige: traduzir problemas de negócio em soluções técnicas viáveis e comunicar resultados de volta às lideranças em linguagem de impacto.</w:t>
       </w:r>
     </w:p>
     <w:p>
@@ -4970,10 +5005,10 @@
         <w:rPr>
           <w:b/>
         </w:rPr>
-        <w:t>Governança e institucionalização</w:t>
+        <w:t>Capacidade de institucionalizar sem criar dependência</w:t>
       </w:r>
       <w:r>
-        <w:t xml:space="preserve"> — Minha experiência ITIL, BPM e ISO 20000 me permite pensar IA não como experimento, mas como serviço gerenciado: com SLA, rastreabilidade, política de uso e continuidade operacional.</w:t>
+        <w:t xml:space="preserve"> — Minha experiência em ITIL, BPM e ISO 20000 me permite projetar soluções de IA que se tornam serviços sustentáveis — com documentação, rastreabilidade e handover — e não iniciativas pessoais que morrem quando o especialista sai.</w:t>
       </w:r>
     </w:p>
     <w:p>
@@ -4994,7 +5029,7 @@
         <w:pStyle w:val="ListBullet"/>
       </w:pPr>
       <w:r>
-        <w:t>Definir e liderar a estratégia de uso de IA aplicada nas áreas corporativas da FGV (Jurídico, Contratos, Acadêmico, Auditoria, RH)</w:t>
+        <w:t>Mapear e priorizar oportunidades de uso de IA nas áreas corporativas da FGV (Jurídico, Contratos, Acadêmico, Auditoria, RH), com análise de viabilidade e retorno esperado</w:t>
       </w:r>
     </w:p>
     <w:p>
@@ -5002,7 +5037,7 @@
         <w:pStyle w:val="ListBullet"/>
       </w:pPr>
       <w:r>
-        <w:t>Avaliar casos de uso de IA propostos pelas áreas de negócio: viabilidade técnica, custo, risco e retorno esperado</w:t>
+        <w:t>Especificar os requisitos funcionais das soluções de IA demandadas pelas áreas de negócio, em colaboração com a equipe de Arquitetura de Sistemas</w:t>
       </w:r>
     </w:p>
     <w:p>
@@ -5010,7 +5045,7 @@
         <w:pStyle w:val="ListBullet"/>
       </w:pPr>
       <w:r>
-        <w:t>Arquitetar e implementar soluções IA em produção (LLMs, RAG, agentes, visão computacional) — ou supervisionar tecnicamente equipes que o façam</w:t>
+        <w:t>Liderar a implementação e operação de soluções de IA aplicada (LLMs, RAG, agentes, ML/NLP, visão computacional) dentro dos padrões técnicos definidos pela Arquitetura</w:t>
       </w:r>
     </w:p>
     <w:p>
@@ -5018,7 +5053,7 @@
         <w:pStyle w:val="ListBullet"/>
       </w:pPr>
       <w:r>
-        <w:t>Estabelecer padrões de integração com APIs de IA e política de uso responsável (LGPD, auditabilidade, qualidade de output)</w:t>
+        <w:t>Medir e reportar os resultados das soluções implementadas: acurácia, economia gerada, processos automatizados, satisfação das áreas</w:t>
       </w:r>
     </w:p>
     <w:p>
@@ -5026,7 +5061,7 @@
         <w:pStyle w:val="ListBullet"/>
       </w:pPr>
       <w:r>
-        <w:t>Ser referência técnica interna em IA generativa, agentes e orquestração de modelos</w:t>
+        <w:t>Atuar como elo qualificado entre as áreas de negócio e a DTI, traduzindo necessidades em requisitos técnicos e resultados em linguagem executiva</w:t>
       </w:r>
     </w:p>
     <w:p>
@@ -5034,7 +5069,7 @@
         <w:pStyle w:val="ListBullet"/>
       </w:pPr>
       <w:r>
-        <w:t>Atuar como elo entre a DTI e as áreas de negócio na identificação de oportunidades de automação inteligente</w:t>
+        <w:t>Apoiar a equipe de Arquitetura com insumos práticos sobre uso de modelos, APIs e ferramentas de IA, a partir da experiência em produção</w:t>
       </w:r>
     </w:p>
     <w:p>
@@ -5049,7 +5084,7 @@
         <w:t>Nível sugerido:</w:t>
       </w:r>
       <w:r>
-        <w:t xml:space="preserve"> Especialista Sênior / Coordenador Técnico (equivalente ao nível do Arquiteto de Soluções, com escopo específico em IA)</w:t>
+        <w:t xml:space="preserve"> Especialista Sênior / Analista de Sistemas Sênior com foco em IA Aplicada</w:t>
       </w:r>
     </w:p>
     <w:p>

</xml_diff>

<commit_message>
docs: reescreve posicionamento do cargo com tom assertivo e sem alusões à Arquitetura
- Posicionamento estratégico reescrito: foco no valor ao negócio, sem referências
  a outras áreas ou linguagem defensiva
- Responsabilidades: incorporado "áreas clientes da SOLCORP", removidas menções
  à equipe de Arquitetura
- Item 2 do perfil limpo da referência a "arquitetura de infraestrutura"

Co-Authored-By: Claude Sonnet 4.6 <noreply@anthropic.com>
</commit_message>
<xml_diff>
--- a/data/oportunidades-fgv/aderencia_perfis_IA_DTI.docx
+++ b/data/oportunidades-fgv/aderencia_perfis_IA_DTI.docx
@@ -4876,16 +4876,16 @@
         <w:spacing w:after="80"/>
       </w:pPr>
       <w:r>
-        <w:t xml:space="preserve">Este cargo opera exclusivamente na </w:t>
+        <w:t xml:space="preserve">Este cargo existe para transformar o potencial da Inteligência Artificial em </w:t>
       </w:r>
       <w:r>
         <w:rPr>
           <w:b/>
         </w:rPr>
-        <w:t>camada de negócio e resultado</w:t>
+        <w:t>resultado concreto para as áreas corporativas da FGV</w:t>
       </w:r>
       <w:r>
-        <w:t>: identifica oportunidades de uso de IA nas áreas corporativas, especifica os requisitos funcionais das soluções e lidera sua implementação junto às áreas demandantes. A infraestrutura de plataformas, a seleção e governança de ferramentas de IA e os padrões de integração corporativa permanecem sob responsabilidade da equipe de Arquitetura de Sistemas — com quem este perfil atua em estreita colaboração, como cliente qualificado e parceiro técnico.</w:t>
+        <w:t>. Seu centro de gravidade é o negócio: identificar onde a IA pode gerar impacto real, especificar o que precisa ser construído e estar à frente da sua implementação junto às áreas clientes da SOLCORP — com responsabilidade sobre entrega, adoção e resultado mensurável.</w:t>
       </w:r>
     </w:p>
     <w:p>
@@ -4893,34 +4893,7 @@
         <w:spacing w:after="80"/>
       </w:pPr>
       <w:r>
-        <w:t xml:space="preserve">Em termos práticos: a Arquitetura define </w:t>
-      </w:r>
-      <w:r>
-        <w:rPr>
-          <w:b/>
-        </w:rPr>
-        <w:t>como</w:t>
-      </w:r>
-      <w:r>
-        <w:t xml:space="preserve"> a IA pode ser usada na empresa; este cargo define </w:t>
-      </w:r>
-      <w:r>
-        <w:rPr>
-          <w:b/>
-        </w:rPr>
-        <w:t>onde</w:t>
-      </w:r>
-      <w:r>
-        <w:t xml:space="preserve"> ela deve ser usada e </w:t>
-      </w:r>
-      <w:r>
-        <w:rPr>
-          <w:b/>
-        </w:rPr>
-        <w:t>garante que gere resultado mensurável</w:t>
-      </w:r>
-      <w:r>
-        <w:t>.</w:t>
+        <w:t>A IA aplicada a processos corporativos é uma disciplina própria. Exige fluência técnica em modelos, pipelines e integração de dados, combinada com leitura precisa do negócio, dos processos e das pessoas envolvidas. É essa combinação — rara no mercado — que justifica um perfil dedicado, com foco, metodologia e histórico de entrega comprovados.</w:t>
       </w:r>
     </w:p>
     <w:p>
@@ -4963,7 +4936,7 @@
         <w:t>Visão de processo + automação inteligente</w:t>
       </w:r>
       <w:r>
-        <w:t xml:space="preserve"> — Process2Diagram é a síntese desta competência: transformar reuniões em BPMN, atas e requisitos automaticamente não é um projeto de TI — é uma reengenharia de processo habilitada por IA. Isso exige simultaneamente domínio de BPM e de orquestração de LLMs, e não se confunde com arquitetura de infraestrutura.</w:t>
+        <w:t xml:space="preserve"> — Process2Diagram é a síntese desta competência: transformar reuniões em BPMN, atas e requisitos automaticamente não é um projeto de TI — é uma reengenharia de processo habilitada por IA. Isso exige simultaneamente domínio de BPM e de orquestração de LLMs.</w:t>
       </w:r>
     </w:p>
     <w:p>
@@ -5037,7 +5010,7 @@
         <w:pStyle w:val="ListBullet"/>
       </w:pPr>
       <w:r>
-        <w:t>Especificar os requisitos funcionais das soluções de IA demandadas pelas áreas de negócio, em colaboração com a equipe de Arquitetura de Sistemas</w:t>
+        <w:t>Especificar os requisitos funcionais das soluções de IA demandadas pelas áreas de negócio, estando à frente da sua implementação junto às áreas clientes da SOLCORP</w:t>
       </w:r>
     </w:p>
     <w:p>
@@ -5045,7 +5018,7 @@
         <w:pStyle w:val="ListBullet"/>
       </w:pPr>
       <w:r>
-        <w:t>Liderar a implementação e operação de soluções de IA aplicada (LLMs, RAG, agentes, ML/NLP, visão computacional) dentro dos padrões técnicos definidos pela Arquitetura</w:t>
+        <w:t>Projetar, implementar e operar soluções de IA aplicada (LLMs, RAG, agentes, ML/NLP, visão computacional) com responsabilidade sobre resultado e continuidade operacional</w:t>
       </w:r>
     </w:p>
     <w:p>
@@ -5062,14 +5035,6 @@
       </w:pPr>
       <w:r>
         <w:t>Atuar como elo qualificado entre as áreas de negócio e a DTI, traduzindo necessidades em requisitos técnicos e resultados em linguagem executiva</w:t>
-      </w:r>
-    </w:p>
-    <w:p>
-      <w:pPr>
-        <w:pStyle w:val="ListBullet"/>
-      </w:pPr>
-      <w:r>
-        <w:t>Apoiar a equipe de Arquitetura com insumos práticos sobre uso de modelos, APIs e ferramentas de IA, a partir da experiência em produção</w:t>
       </w:r>
     </w:p>
     <w:p>

</xml_diff>